<commit_message>
fix(textbook): disable pandoc auto-numbering so chapter labels match TOC
numbersections: true was layering pandoc's auto-numbers ("3 Chapter 1: ...",
"3.1 What the cloud is") on top of the manual "Chapter N:" / "N.M" labels
already in the markdown. The PDF showed two competing numbering systems.

Also removed a dangling cross-reference link to a non-existent
"pinned-decisions" anchor that was producing a LaTeX undefined-reference
warning.
</commit_message>
<xml_diff>
--- a/docs/textbook/platform-engineering-handbook.docx
+++ b/docs/textbook/platform-engineering-handbook.docx
@@ -41103,21 +41103,7 @@
         <w:pStyle w:val="FirstParagraph"/>
       </w:pPr>
       <w:r>
-        <w:t xml:space="preserve">Key choices we lock in (see</w:t>
-      </w:r>
-      <w:r>
-        <w:t xml:space="preserve"> </w:t>
-      </w:r>
-      <w:hyperlink w:anchor="pinned-decisions-in-our-lab">
-        <w:r>
-          <w:rPr>
-            <w:rStyle w:val="Hyperlink"/>
-          </w:rPr>
-          <w:t xml:space="preserve">pinned decisions</w:t>
-        </w:r>
-      </w:hyperlink>
-      <w:r>
-        <w:t xml:space="preserve">):</w:t>
+        <w:t xml:space="preserve">Key choices we lock in:</w:t>
       </w:r>
     </w:p>
     <w:tbl>

</xml_diff>